<commit_message>
fixed the website and off to the races..
</commit_message>
<xml_diff>
--- a/docs/activities/lecture_01/01_class_activity.docx
+++ b/docs/activities/lecture_01/01_class_activity.docx
@@ -168,13 +168,7 @@
         </w:numPr>
       </w:pPr>
       <w:r>
-        <w:t xml:space="preserve">Point out the North versus South side of a pine tree and how</w:t>
-      </w:r>
-      <w:r>
-        <w:t xml:space="preserve"> </w:t>
-      </w:r>
-      <w:r>
-        <w:t xml:space="preserve">weather might affect the needled dimensions</w:t>
+        <w:t xml:space="preserve">Point out the North versus South side of a pine tree and how weather might affect the needled dimensions</w:t>
       </w:r>
     </w:p>
     <w:p>

</xml_diff>